<commit_message>
docs: Exhaust 스텁 예시에 실측 3D 다이어그램 추가(matplotlib)
실제 표본 배관(GUID 2014e40a)의 3D 형상 + X-Z 측면 투영 그림을 생성해 문서에 삽입.
- 장비 WTNHJ02_(주황)·레터럴 덕트(청록) AABB 와이어프레임
- 출발 스텁(빨강, 장비 바닥 -z)·중간 수평 런(회색)·종단 스텁(파랑, 덕트 상부 +z)
- 출발/종단 PoC 마커 + 측면 투영의 '하강→수평→진입' 프로파일
make_figure(matplotlib Agg) → docs/routing3d_stub_example_exhaust_fig.png → docx 삽입.

Co-Authored-By: Claude Opus 4.8 (1M context) <noreply@anthropic.com>
</commit_message>
<xml_diff>
--- a/docs/routing3d_stub_example_exhaust.docx
+++ b/docs/routing3d_stub_example_exhaust.docx
@@ -427,6 +427,53 @@
           <w:sz w:val="17"/>
         </w:rPr>
         <w:t xml:space="preserve">  12 (190175,  8931, 12948)   ← 종단 PoC(덕트 상부면)</w:t>
+      </w:r>
+    </w:p>
+    <w:p>
+      <w:r>
+        <w:drawing>
+          <wp:inline xmlns:a="http://schemas.openxmlformats.org/drawingml/2006/main" xmlns:pic="http://schemas.openxmlformats.org/drawingml/2006/picture">
+            <wp:extent cx="6035040" cy="2649913"/>
+            <wp:docPr id="1" name="Picture 1"/>
+            <wp:cNvGraphicFramePr>
+              <a:graphicFrameLocks noChangeAspect="1"/>
+            </wp:cNvGraphicFramePr>
+            <a:graphic>
+              <a:graphicData uri="http://schemas.openxmlformats.org/drawingml/2006/picture">
+                <pic:pic>
+                  <pic:nvPicPr>
+                    <pic:cNvPr id="0" name="routing3d_stub_example_exhaust_fig.png"/>
+                    <pic:cNvPicPr/>
+                  </pic:nvPicPr>
+                  <pic:blipFill>
+                    <a:blip r:embed="rId9"/>
+                    <a:stretch>
+                      <a:fillRect/>
+                    </a:stretch>
+                  </pic:blipFill>
+                  <pic:spPr>
+                    <a:xfrm>
+                      <a:off x="0" y="0"/>
+                      <a:ext cx="6035040" cy="2649913"/>
+                    </a:xfrm>
+                    <a:prstGeom prst="rect"/>
+                  </pic:spPr>
+                </pic:pic>
+              </a:graphicData>
+            </a:graphic>
+          </wp:inline>
+        </w:drawing>
+      </w:r>
+    </w:p>
+    <w:p>
+      <w:r>
+        <w:rPr>
+          <w:rFonts w:ascii="Malgun Gothic" w:hAnsi="Malgun Gothic" w:eastAsia="Malgun Gothic"/>
+          <w:b w:val="0"/>
+          <w:color w:val="707070"/>
+          <w:sz w:val="18"/>
+        </w:rPr>
+        <w:t>그림 1. 실측 표본 배관의 3D 형상(좌)과 X-Z 측면 투영(우). 주황=장비 WTNHJ02_ AABB, 청록=레터럴 덕트 AABB. 빨강=출발 스텁(EQUIP, 장비 바닥 −z), 회색=중간 수평 런, 파랑=종단 스텁(DUCT, 덕트 상부 +z). 빨강 점=출발 PoC, 파랑 점=종단 PoC. 측면 투영에서 ‘아래로 하강 → 랙에서 수평 → 위로 진입’ 프로파일이 또렷하다.</w:t>
       </w:r>
     </w:p>
     <w:p>

</xml_diff>